<commit_message>
chore: update NguyenQuocViet_23CEB029.docx with new content
</commit_message>
<xml_diff>
--- a/NguyenQuocViet_23CEB029.docx
+++ b/NguyenQuocViet_23CEB029.docx
@@ -825,7 +825,7 @@
                 <w:sz w:val="26"/>
                 <w:szCs w:val="26"/>
               </w:rPr>
-              <w:t>Làm quen với cấu trúc React Native.</w:t>
+              <w:t>Làm quen với cấu trúc Flutter.</w:t>
             </w:r>
           </w:p>
           <w:p>
@@ -2200,7 +2200,7 @@
                 <w:sz w:val="26"/>
                 <w:szCs w:val="26"/>
               </w:rPr>
-              <w:t>Làm quen với các Core Component như: StyleSheet, View, Text, Image, TextInput và thư viện Audio của React Native.</w:t>
+              <w:t>Làm quen với các Core Component như: StyleSheet, View, Text, Image, TextInput và thư viện Audio của Flutter.</w:t>
             </w:r>
           </w:p>
           <w:p>

</xml_diff>